<commit_message>
Bangun ulang docx setelah bagian cara membangun ditambahkan
Co-Authored-By: Claude Opus 5 <noreply@anthropic.com>
</commit_message>
<xml_diff>
--- a/docs/SPESIFIKASI-KAATAGO.docx
+++ b/docs/SPESIFIKASI-KAATAGO.docx
@@ -19791,6 +19791,102 @@
           <w:sz w:val="21"/>
         </w:rPr>
         <w:t>Dokumen ini disusun dari kode versi 1.34.0. Setiap perbedaan antara dokumen dan aplikasi adalah temuan yang layak dilaporkan — bukan kesalahan pembacaan penguji.</w:t>
+      </w:r>
+    </w:p>
+    <w:p>
+      <w:pPr>
+        <w:pStyle w:val="Heading1"/>
+      </w:pPr>
+      <w:r>
+        <w:t>Cara membangun ulang dokumen ini</w:t>
+      </w:r>
+    </w:p>
+    <w:p>
+      <w:r>
+        <w:rPr>
+          <w:sz w:val="21"/>
+        </w:rPr>
+        <w:t>Berkas Word (</w:t>
+      </w:r>
+      <w:r>
+        <w:rPr>
+          <w:rFonts w:ascii="Consolas" w:hAnsi="Consolas"/>
+          <w:color w:val="3730A3"/>
+          <w:sz w:val="21"/>
+        </w:rPr>
+        <w:t>SPESIFIKASI-KAATAGO.docx</w:t>
+      </w:r>
+      <w:r>
+        <w:rPr>
+          <w:sz w:val="21"/>
+        </w:rPr>
+        <w:t xml:space="preserve">) </w:t>
+      </w:r>
+      <w:r>
+        <w:rPr>
+          <w:b/>
+          <w:sz w:val="21"/>
+        </w:rPr>
+        <w:t>dihasilkan</w:t>
+      </w:r>
+      <w:r>
+        <w:rPr>
+          <w:sz w:val="21"/>
+        </w:rPr>
+        <w:t xml:space="preserve"> dari berkas Markdown ini, bukan diketik terpisah. Setelah mengubah isinya:</w:t>
+      </w:r>
+    </w:p>
+    <w:p>
+      <w:pPr>
+        <w:shd w:val="clear" w:fill="F2F3F8"/>
+        <w:spacing w:before="80"/>
+        <w:ind w:left="283"/>
+      </w:pPr>
+      <w:r>
+        <w:rPr>
+          <w:rFonts w:ascii="Consolas" w:hAnsi="Consolas"/>
+          <w:color w:val="3730A3"/>
+          <w:sz w:val="19"/>
+        </w:rPr>
+        <w:t>python3 -m pip install --user python-docx      # sekali saja</w:t>
+        <w:br/>
+        <w:t>/usr/bin/python3 scripts/render_diagram_alur.py    # kalau diagramnya berubah</w:t>
+        <w:br/>
+        <w:t>/usr/bin/python3 scripts/spesifikasi_ke_docx.py</w:t>
+      </w:r>
+    </w:p>
+    <w:p>
+      <w:r>
+        <w:rPr>
+          <w:sz w:val="21"/>
+        </w:rPr>
+        <w:t xml:space="preserve">Daftar isi di Word memakai </w:t>
+      </w:r>
+      <w:r>
+        <w:rPr>
+          <w:i/>
+          <w:sz w:val="21"/>
+        </w:rPr>
+        <w:t>field</w:t>
+      </w:r>
+      <w:r>
+        <w:rPr>
+          <w:sz w:val="21"/>
+        </w:rPr>
+        <w:t xml:space="preserve"> — buka dokumennya, klik kanan pada daftar isi, lalu </w:t>
+      </w:r>
+      <w:r>
+        <w:rPr>
+          <w:b/>
+          <w:sz w:val="21"/>
+        </w:rPr>
+        <w:t>Update Field</w:t>
+      </w:r>
+      <w:r>
+        <w:rPr>
+          <w:sz w:val="21"/>
+        </w:rPr>
+        <w:t xml:space="preserve"> untuk memuat nomor halamannya.</w:t>
       </w:r>
     </w:p>
     <w:sectPr>

</xml_diff>

<commit_message>
Test case: 243 kasus, keluarannya xlsx bukan Word
Test case bukan bahan bacaan seperti FSD dan TSD — ia daftar kerja.
Penguji perlu menyaring per prioritas, mengurutkan per modul, dan
menuliskan hasilnya di sebelah tiap baris; Word tidak bisa satu pun
dari itu.

Xlsx-nya menambahkan kolom Hasil/Catatan/Diuji Oleh, dengan daftar
pilihan supaya isinya seragam, plus lembar Rekap yang menghitung
sendiri lewat COUNTIFS.

Matriks pengujian lama di SPESIFIKASI masih menyebut versi 1.34.0 dan
layar yang sudah berganti nama; diarahkan ke dokumen baru supaya tidak
ada dua daftar yang berbeda isinya.

Co-Authored-By: Claude Opus 5 <noreply@anthropic.com>
</commit_message>
<xml_diff>
--- a/docs/SPESIFIKASI-KAATAGO.docx
+++ b/docs/SPESIFIKASI-KAATAGO.docx
@@ -19055,7 +19055,7 @@
         <w:pStyle w:val="Heading1"/>
       </w:pPr>
       <w:r>
-        <w:t>13. Matriks Pengujian Ringkas</w:t>
+        <w:t>13. Matriks Pengujian</w:t>
       </w:r>
     </w:p>
     <w:p>
@@ -19063,616 +19063,44 @@
         <w:rPr>
           <w:sz w:val="21"/>
         </w:rPr>
-        <w:t>Prioritas untuk rilis 1.34.0.</w:t>
+        <w:t xml:space="preserve">Matriks ringkas yang dulu ada di sini sudah </w:t>
+      </w:r>
+      <w:r>
+        <w:rPr>
+          <w:b/>
+          <w:sz w:val="21"/>
+        </w:rPr>
+        <w:t>digantikan dokumen tersendiri</w:t>
+      </w:r>
+      <w:r>
+        <w:rPr>
+          <w:sz w:val="21"/>
+        </w:rPr>
+        <w:t xml:space="preserve">: </w:t>
+      </w:r>
+      <w:r>
+        <w:rPr>
+          <w:rFonts w:ascii="Consolas" w:hAnsi="Consolas"/>
+          <w:color w:val="3730A3"/>
+          <w:sz w:val="21"/>
+        </w:rPr>
+        <w:t>TEST-CASE-KAATAGO</w:t>
+      </w:r>
+      <w:r>
+        <w:rPr>
+          <w:sz w:val="21"/>
+        </w:rPr>
+        <w:t xml:space="preserve"> — 235 kasus uji berikut prioritas, langkah, hasil yang diharapkan, dan rujukan ke ID kebutuhan FSD maupun bab TSD.</w:t>
       </w:r>
     </w:p>
-    <w:tbl>
-      <w:tblPr>
-        <w:tblStyle w:val="TableGrid"/>
-        <w:tblW w:type="auto" w:w="0"/>
-        <w:tblLayout w:type="autofit"/>
-        <w:tblLook w:firstColumn="1" w:firstRow="1" w:lastColumn="0" w:lastRow="0" w:noHBand="0" w:noVBand="1" w:val="04A0"/>
-      </w:tblPr>
-      <w:tblGrid>
-        <w:gridCol w:w="3286"/>
-        <w:gridCol w:w="3286"/>
-        <w:gridCol w:w="3286"/>
-      </w:tblGrid>
-      <w:tr>
-        <w:trPr>
-          <w:tblHeader w:val="true"/>
-        </w:trPr>
-        <w:tc>
-          <w:tcPr>
-            <w:tcW w:type="dxa" w:w="3286"/>
-            <w:shd w:val="clear" w:fill="4F46E5"/>
-          </w:tcPr>
-          <w:p>
-            <w:pPr>
-              <w:spacing w:after="40" w:before="40"/>
-            </w:pPr>
-            <w:r>
-              <w:rPr>
-                <w:b/>
-                <w:color w:val="FFFFFF"/>
-                <w:sz w:val="19"/>
-              </w:rPr>
-              <w:t>Prioritas</w:t>
-            </w:r>
-          </w:p>
-        </w:tc>
-        <w:tc>
-          <w:tcPr>
-            <w:tcW w:type="dxa" w:w="3286"/>
-            <w:shd w:val="clear" w:fill="4F46E5"/>
-          </w:tcPr>
-          <w:p>
-            <w:pPr>
-              <w:spacing w:after="40" w:before="40"/>
-            </w:pPr>
-            <w:r>
-              <w:rPr>
-                <w:b/>
-                <w:color w:val="FFFFFF"/>
-                <w:sz w:val="19"/>
-              </w:rPr>
-              <w:t>Modul</w:t>
-            </w:r>
-          </w:p>
-        </w:tc>
-        <w:tc>
-          <w:tcPr>
-            <w:tcW w:type="dxa" w:w="3286"/>
-            <w:shd w:val="clear" w:fill="4F46E5"/>
-          </w:tcPr>
-          <w:p>
-            <w:pPr>
-              <w:spacing w:after="40" w:before="40"/>
-            </w:pPr>
-            <w:r>
-              <w:rPr>
-                <w:b/>
-                <w:color w:val="FFFFFF"/>
-                <w:sz w:val="19"/>
-              </w:rPr>
-              <w:t>Fokus</w:t>
-            </w:r>
-          </w:p>
-        </w:tc>
-      </w:tr>
-      <w:tr>
-        <w:tc>
-          <w:tcPr>
-            <w:tcW w:type="dxa" w:w="3286"/>
-          </w:tcPr>
-          <w:p>
-            <w:pPr>
-              <w:spacing w:after="40" w:before="40"/>
-            </w:pPr>
-            <w:r>
-              <w:rPr>
-                <w:b/>
-                <w:sz w:val="19"/>
-              </w:rPr>
-              <w:t>P1</w:t>
-            </w:r>
-          </w:p>
-        </w:tc>
-        <w:tc>
-          <w:tcPr>
-            <w:tcW w:type="dxa" w:w="3286"/>
-          </w:tcPr>
-          <w:p>
-            <w:pPr>
-              <w:spacing w:after="40" w:before="40"/>
-            </w:pPr>
-            <w:r>
-              <w:rPr>
-                <w:sz w:val="19"/>
-              </w:rPr>
-              <w:t>Pending Payment</w:t>
-            </w:r>
-          </w:p>
-        </w:tc>
-        <w:tc>
-          <w:tcPr>
-            <w:tcW w:type="dxa" w:w="3286"/>
-          </w:tcPr>
-          <w:p>
-            <w:pPr>
-              <w:spacing w:after="40" w:before="40"/>
-            </w:pPr>
-            <w:r>
-              <w:rPr>
-                <w:sz w:val="19"/>
-              </w:rPr>
-              <w:t>Alur ujung ke ujung 4.2, termasuk perpindahan ke Riwayat Transaksi</w:t>
-            </w:r>
-          </w:p>
-        </w:tc>
-      </w:tr>
-      <w:tr>
-        <w:tc>
-          <w:tcPr>
-            <w:tcW w:type="dxa" w:w="3286"/>
-            <w:shd w:val="clear" w:fill="F4F5FB"/>
-          </w:tcPr>
-          <w:p>
-            <w:pPr>
-              <w:spacing w:after="40" w:before="40"/>
-            </w:pPr>
-            <w:r>
-              <w:rPr>
-                <w:b/>
-                <w:sz w:val="19"/>
-              </w:rPr>
-              <w:t>P1</w:t>
-            </w:r>
-          </w:p>
-        </w:tc>
-        <w:tc>
-          <w:tcPr>
-            <w:tcW w:type="dxa" w:w="3286"/>
-            <w:shd w:val="clear" w:fill="F4F5FB"/>
-          </w:tcPr>
-          <w:p>
-            <w:pPr>
-              <w:spacing w:after="40" w:before="40"/>
-            </w:pPr>
-            <w:r>
-              <w:rPr>
-                <w:sz w:val="19"/>
-              </w:rPr>
-              <w:t>Pemetaan GL pesanan tunai pelanggan</w:t>
-            </w:r>
-          </w:p>
-        </w:tc>
-        <w:tc>
-          <w:tcPr>
-            <w:tcW w:type="dxa" w:w="3286"/>
-            <w:shd w:val="clear" w:fill="F4F5FB"/>
-          </w:tcPr>
-          <w:p>
-            <w:pPr>
-              <w:spacing w:after="40" w:before="40"/>
-            </w:pPr>
-            <w:r>
-              <w:rPr>
-                <w:sz w:val="19"/>
-              </w:rPr>
-              <w:t>Harus masuk GL Tunai &amp; Saldo Cash (7.4)</w:t>
-            </w:r>
-          </w:p>
-        </w:tc>
-      </w:tr>
-      <w:tr>
-        <w:tc>
-          <w:tcPr>
-            <w:tcW w:type="dxa" w:w="3286"/>
-          </w:tcPr>
-          <w:p>
-            <w:pPr>
-              <w:spacing w:after="40" w:before="40"/>
-            </w:pPr>
-            <w:r>
-              <w:rPr>
-                <w:b/>
-                <w:sz w:val="19"/>
-              </w:rPr>
-              <w:t>P1</w:t>
-            </w:r>
-          </w:p>
-        </w:tc>
-        <w:tc>
-          <w:tcPr>
-            <w:tcW w:type="dxa" w:w="3286"/>
-          </w:tcPr>
-          <w:p>
-            <w:pPr>
-              <w:spacing w:after="40" w:before="40"/>
-            </w:pPr>
-            <w:r>
-              <w:rPr>
-                <w:sz w:val="19"/>
-              </w:rPr>
-              <w:t>Notifikasi hasil pengajuan</w:t>
-            </w:r>
-          </w:p>
-        </w:tc>
-        <w:tc>
-          <w:tcPr>
-            <w:tcW w:type="dxa" w:w="3286"/>
-          </w:tcPr>
-          <w:p>
-            <w:pPr>
-              <w:spacing w:after="40" w:before="40"/>
-            </w:pPr>
-            <w:r>
-              <w:rPr>
-                <w:sz w:val="19"/>
-              </w:rPr>
-              <w:t>Semua kombinasi setuju/tolak × setoran/petty cash</w:t>
-            </w:r>
-          </w:p>
-        </w:tc>
-      </w:tr>
-      <w:tr>
-        <w:tc>
-          <w:tcPr>
-            <w:tcW w:type="dxa" w:w="3286"/>
-            <w:shd w:val="clear" w:fill="F4F5FB"/>
-          </w:tcPr>
-          <w:p>
-            <w:pPr>
-              <w:spacing w:after="40" w:before="40"/>
-            </w:pPr>
-            <w:r>
-              <w:rPr>
-                <w:b/>
-                <w:sz w:val="19"/>
-              </w:rPr>
-              <w:t>P1</w:t>
-            </w:r>
-          </w:p>
-        </w:tc>
-        <w:tc>
-          <w:tcPr>
-            <w:tcW w:type="dxa" w:w="3286"/>
-            <w:shd w:val="clear" w:fill="F4F5FB"/>
-          </w:tcPr>
-          <w:p>
-            <w:pPr>
-              <w:spacing w:after="40" w:before="40"/>
-            </w:pPr>
-            <w:r>
-              <w:rPr>
-                <w:sz w:val="19"/>
-              </w:rPr>
-              <w:t>Prasyarat SQL</w:t>
-            </w:r>
-          </w:p>
-        </w:tc>
-        <w:tc>
-          <w:tcPr>
-            <w:tcW w:type="dxa" w:w="3286"/>
-            <w:shd w:val="clear" w:fill="F4F5FB"/>
-          </w:tcPr>
-          <w:p>
-            <w:pPr>
-              <w:spacing w:after="40" w:before="40"/>
-            </w:pPr>
-            <w:r>
-              <w:rPr>
-                <w:sz w:val="19"/>
-              </w:rPr>
-              <w:t>Jalankan keempat berkas (bagian 10) sebelum pengujian apa pun</w:t>
-            </w:r>
-          </w:p>
-        </w:tc>
-      </w:tr>
-      <w:tr>
-        <w:tc>
-          <w:tcPr>
-            <w:tcW w:type="dxa" w:w="3286"/>
-          </w:tcPr>
-          <w:p>
-            <w:pPr>
-              <w:spacing w:after="40" w:before="40"/>
-            </w:pPr>
-            <w:r>
-              <w:rPr>
-                <w:b/>
-                <w:sz w:val="19"/>
-              </w:rPr>
-              <w:t>P2</w:t>
-            </w:r>
-          </w:p>
-        </w:tc>
-        <w:tc>
-          <w:tcPr>
-            <w:tcW w:type="dxa" w:w="3286"/>
-          </w:tcPr>
-          <w:p>
-            <w:pPr>
-              <w:spacing w:after="40" w:before="40"/>
-            </w:pPr>
-            <w:r>
-              <w:rPr>
-                <w:sz w:val="19"/>
-              </w:rPr>
-              <w:t>Penanda merah</w:t>
-            </w:r>
-          </w:p>
-        </w:tc>
-        <w:tc>
-          <w:tcPr>
-            <w:tcW w:type="dxa" w:w="3286"/>
-          </w:tcPr>
-          <w:p>
-            <w:pPr>
-              <w:spacing w:after="40" w:before="40"/>
-            </w:pPr>
-            <w:r>
-              <w:rPr>
-                <w:sz w:val="19"/>
-              </w:rPr>
-              <w:t>Finance, Owner, Kasir, Admin, Kotak Masuk</w:t>
-            </w:r>
-          </w:p>
-        </w:tc>
-      </w:tr>
-      <w:tr>
-        <w:tc>
-          <w:tcPr>
-            <w:tcW w:type="dxa" w:w="3286"/>
-            <w:shd w:val="clear" w:fill="F4F5FB"/>
-          </w:tcPr>
-          <w:p>
-            <w:pPr>
-              <w:spacing w:after="40" w:before="40"/>
-            </w:pPr>
-            <w:r>
-              <w:rPr>
-                <w:b/>
-                <w:sz w:val="19"/>
-              </w:rPr>
-              <w:t>P2</w:t>
-            </w:r>
-          </w:p>
-        </w:tc>
-        <w:tc>
-          <w:tcPr>
-            <w:tcW w:type="dxa" w:w="3286"/>
-            <w:shd w:val="clear" w:fill="F4F5FB"/>
-          </w:tcPr>
-          <w:p>
-            <w:pPr>
-              <w:spacing w:after="40" w:before="40"/>
-            </w:pPr>
-            <w:r>
-              <w:rPr>
-                <w:sz w:val="19"/>
-              </w:rPr>
-              <w:t>QR Meja borongan</w:t>
-            </w:r>
-          </w:p>
-        </w:tc>
-        <w:tc>
-          <w:tcPr>
-            <w:tcW w:type="dxa" w:w="3286"/>
-            <w:shd w:val="clear" w:fill="F4F5FB"/>
-          </w:tcPr>
-          <w:p>
-            <w:pPr>
-              <w:spacing w:after="40" w:before="40"/>
-            </w:pPr>
-            <w:r>
-              <w:rPr>
-                <w:sz w:val="19"/>
-              </w:rPr>
-              <w:t>Rentang, nol di depan, simpan galeri, batas 100</w:t>
-            </w:r>
-          </w:p>
-        </w:tc>
-      </w:tr>
-      <w:tr>
-        <w:tc>
-          <w:tcPr>
-            <w:tcW w:type="dxa" w:w="3286"/>
-          </w:tcPr>
-          <w:p>
-            <w:pPr>
-              <w:spacing w:after="40" w:before="40"/>
-            </w:pPr>
-            <w:r>
-              <w:rPr>
-                <w:b/>
-                <w:sz w:val="19"/>
-              </w:rPr>
-              <w:t>P2</w:t>
-            </w:r>
-          </w:p>
-        </w:tc>
-        <w:tc>
-          <w:tcPr>
-            <w:tcW w:type="dxa" w:w="3286"/>
-          </w:tcPr>
-          <w:p>
-            <w:pPr>
-              <w:spacing w:after="40" w:before="40"/>
-            </w:pPr>
-            <w:r>
-              <w:rPr>
-                <w:sz w:val="19"/>
-              </w:rPr>
-              <w:t>Riwayat Transaksi</w:t>
-            </w:r>
-          </w:p>
-        </w:tc>
-        <w:tc>
-          <w:tcPr>
-            <w:tcW w:type="dxa" w:w="3286"/>
-          </w:tcPr>
-          <w:p>
-            <w:pPr>
-              <w:spacing w:after="40" w:before="40"/>
-            </w:pPr>
-            <w:r>
-              <w:rPr>
-                <w:sz w:val="19"/>
-              </w:rPr>
-              <w:t>Total harian harus cocok dengan isi laci</w:t>
-            </w:r>
-          </w:p>
-        </w:tc>
-      </w:tr>
-      <w:tr>
-        <w:tc>
-          <w:tcPr>
-            <w:tcW w:type="dxa" w:w="3286"/>
-            <w:shd w:val="clear" w:fill="F4F5FB"/>
-          </w:tcPr>
-          <w:p>
-            <w:pPr>
-              <w:spacing w:after="40" w:before="40"/>
-            </w:pPr>
-            <w:r>
-              <w:rPr>
-                <w:b/>
-                <w:sz w:val="19"/>
-              </w:rPr>
-              <w:t>P3</w:t>
-            </w:r>
-          </w:p>
-        </w:tc>
-        <w:tc>
-          <w:tcPr>
-            <w:tcW w:type="dxa" w:w="3286"/>
-            <w:shd w:val="clear" w:fill="F4F5FB"/>
-          </w:tcPr>
-          <w:p>
-            <w:pPr>
-              <w:spacing w:after="40" w:before="40"/>
-            </w:pPr>
-            <w:r>
-              <w:rPr>
-                <w:sz w:val="19"/>
-              </w:rPr>
-              <w:t>Validasi isian</w:t>
-            </w:r>
-          </w:p>
-        </w:tc>
-        <w:tc>
-          <w:tcPr>
-            <w:tcW w:type="dxa" w:w="3286"/>
-            <w:shd w:val="clear" w:fill="F4F5FB"/>
-          </w:tcPr>
-          <w:p>
-            <w:pPr>
-              <w:spacing w:after="40" w:before="40"/>
-            </w:pPr>
-            <w:r>
-              <w:rPr>
-                <w:sz w:val="19"/>
-              </w:rPr>
-              <w:t xml:space="preserve">Setiap kolom di tabel 6.1, </w:t>
-            </w:r>
-            <w:r>
-              <w:rPr>
-                <w:b/>
-                <w:sz w:val="19"/>
-              </w:rPr>
-              <w:t>diuji dengan tempel</w:t>
-            </w:r>
-          </w:p>
-        </w:tc>
-      </w:tr>
-      <w:tr>
-        <w:tc>
-          <w:tcPr>
-            <w:tcW w:type="dxa" w:w="3286"/>
-          </w:tcPr>
-          <w:p>
-            <w:pPr>
-              <w:spacing w:after="40" w:before="40"/>
-            </w:pPr>
-            <w:r>
-              <w:rPr>
-                <w:b/>
-                <w:sz w:val="19"/>
-              </w:rPr>
-              <w:t>P3</w:t>
-            </w:r>
-          </w:p>
-        </w:tc>
-        <w:tc>
-          <w:tcPr>
-            <w:tcW w:type="dxa" w:w="3286"/>
-          </w:tcPr>
-          <w:p>
-            <w:pPr>
-              <w:spacing w:after="40" w:before="40"/>
-            </w:pPr>
-            <w:r>
-              <w:rPr>
-                <w:sz w:val="19"/>
-              </w:rPr>
-              <w:t>Logo</w:t>
-            </w:r>
-          </w:p>
-        </w:tc>
-        <w:tc>
-          <w:tcPr>
-            <w:tcW w:type="dxa" w:w="3286"/>
-          </w:tcPr>
-          <w:p>
-            <w:pPr>
-              <w:spacing w:after="40" w:before="40"/>
-            </w:pPr>
-            <w:r>
-              <w:rPr>
-                <w:sz w:val="19"/>
-              </w:rPr>
-              <w:t>Ikon aplikasi, splash, header, ikon notifikasi</w:t>
-            </w:r>
-          </w:p>
-        </w:tc>
-      </w:tr>
-      <w:tr>
-        <w:tc>
-          <w:tcPr>
-            <w:tcW w:type="dxa" w:w="3286"/>
-            <w:shd w:val="clear" w:fill="F4F5FB"/>
-          </w:tcPr>
-          <w:p>
-            <w:pPr>
-              <w:spacing w:after="40" w:before="40"/>
-            </w:pPr>
-            <w:r>
-              <w:rPr>
-                <w:b/>
-                <w:sz w:val="19"/>
-              </w:rPr>
-              <w:t>P3</w:t>
-            </w:r>
-          </w:p>
-        </w:tc>
-        <w:tc>
-          <w:tcPr>
-            <w:tcW w:type="dxa" w:w="3286"/>
-            <w:shd w:val="clear" w:fill="F4F5FB"/>
-          </w:tcPr>
-          <w:p>
-            <w:pPr>
-              <w:spacing w:after="40" w:before="40"/>
-            </w:pPr>
-            <w:r>
-              <w:rPr>
-                <w:sz w:val="19"/>
-              </w:rPr>
-              <w:t>Multi-resto</w:t>
-            </w:r>
-          </w:p>
-        </w:tc>
-        <w:tc>
-          <w:tcPr>
-            <w:tcW w:type="dxa" w:w="3286"/>
-            <w:shd w:val="clear" w:fill="F4F5FB"/>
-          </w:tcPr>
-          <w:p>
-            <w:pPr>
-              <w:spacing w:after="40" w:before="40"/>
-            </w:pPr>
-            <w:r>
-              <w:rPr>
-                <w:sz w:val="19"/>
-              </w:rPr>
-              <w:t>Isolasi data antar cabang</w:t>
-            </w:r>
-          </w:p>
-        </w:tc>
-      </w:tr>
-    </w:tbl>
+    <w:p>
+      <w:r>
+        <w:rPr>
+          <w:sz w:val="21"/>
+        </w:rPr>
+        <w:t>Matriks lama disusun untuk versi 1.34.0 dan menyebut layar yang sudah berganti nama sejak itu. Membiarkannya di sini berarti dua daftar pengujian yang berbeda isinya, dan yang membacanya tidak punya cara tahu mana yang berlaku.</w:t>
+      </w:r>
+    </w:p>
     <w:p>
       <w:r>
         <w:rPr>

</xml_diff>